<commit_message>
Normaliza la descripción de las fuentes editables
</commit_message>
<xml_diff>
--- a/material_abierto/00_guias/editables/Guia_de_estudio_Big_Data_Processing_II_2026-2027.docx
+++ b/material_abierto/00_guias/editables/Guia_de_estudio_Big_Data_Processing_II_2026-2027.docx
@@ -440,7 +440,7 @@
               <w:widowControl/>
             </w:pPr>
             <w:r>
-              <w:t>Esta edición se basa en la guía docente oficial publicada el 7 de julio de 2026 y en los materiales disponibles en el repositorio a 30 de septiembre de 2026. Las presentaciones de los seis temas están incorporadas. Las fuentes LaTeX de los temas 5 y 6 son reconstrucciones documentadas a partir de sus PDF, no los originales de autor.</w:t>
+              <w:t>Esta edición se basa en la guía docente oficial publicada el 7 de julio de 2026 y en los materiales disponibles en el repositorio a 30 de septiembre de 2026. Las presentaciones y las fuentes LaTeX editables de los seis temas están incorporadas.</w:t>
             </w:r>
           </w:p>
         </w:tc>
@@ -6359,7 +6359,7 @@
               <w:rPr>
                 <w:sz w:val="17"/>
               </w:rPr>
-              <w:t>Temas 1–6; las de T5–T6 son reconstrucciones desde PDF</w:t>
+              <w:t>Fuentes LaTeX de los temas 1–6</w:t>
             </w:r>
           </w:p>
         </w:tc>
@@ -6651,7 +6651,7 @@
     </w:p>
     <w:p>
       <w:r>
-        <w:t>Los PDF de los seis temas y el enunciado de la práctica final están incorporados. Las fuentes de los temas 5 y 6 son reconstrucciones fieles desde PDF, están identificadas como tales y han sido validadas mediante compilación y comparación textual con los documentos de trabajo.</w:t>
+        <w:t>Los PDF de los seis temas y el enunciado de la práctica final están incorporados. Las fuentes LaTeX editables de los seis temas han sido verificadas mediante compilación.</w:t>
       </w:r>
     </w:p>
     <w:p>

</xml_diff>